<commit_message>
Fix split-year dates in Word files using lxml paragraph-level processing
Years like 2025/2026 were split across XML runs (e.g. "202"+"6") in
headers, footers, and textboxes, causing previous raw replacement to miss
238 instances. Now uses lxml to concatenate paragraph text, replace dates
atomically, and redistribute text back preserving formatting.

Co-Authored-By: Claude Opus 4.6 <noreply@anthropic.com>
Claude-Session: https://claude.ai/code/session_017tEAoTM3ofSdc6PteZCeVk
</commit_message>
<xml_diff>
--- a/2026 الى 2027/التكليف 2027/الفصل الأول/تكليف الاختبارات للفصل الاول -كيمياء 2027.docx
+++ b/2026 الى 2027/التكليف 2027/الفصل الأول/تكليف الاختبارات للفصل الاول -كيمياء 2027.docx
@@ -222,7 +222,7 @@
           <w:rtl/>
           <w:lang w:bidi="ar-QA"/>
         </w:rPr>
-        <w:t>5</w:t>
+        <w:t>6</w:t>
       </w:r>
       <w:r>
         <w:rPr>
@@ -248,7 +248,7 @@
           <w:rtl/>
           <w:lang w:bidi="ar-QA"/>
         </w:rPr>
-        <w:t>6</w:t>
+        <w:t>7</w:t>
       </w:r>
       <w:r>
         <w:rPr>
@@ -315,7 +315,7 @@
           <w:rtl/>
           <w:lang w:bidi="ar-QA"/>
         </w:rPr>
-        <w:t>5</w:t>
+        <w:t>6</w:t>
       </w:r>
       <w:r>
         <w:rPr>
@@ -345,7 +345,7 @@
           <w:rtl/>
           <w:lang w:bidi="ar-QA"/>
         </w:rPr>
-        <w:t>6</w:t>
+        <w:t>7</w:t>
       </w:r>
       <w:r>
         <w:rPr>

</xml_diff>